<commit_message>
fix: template variable names, remove orphaned director-building loops
- item. → this. in Board Consent table conditionals
- NonFounderOfficers_yn → non_founder_officers_yn (match seed)
- NonFounderDirectors_yn → non_founder_directors_yn (match seed)
- nonfounderdirectors → non_founder_directors (match seed)
- officers → non_founder_officers (match seed collection name)
- Action of Incorporator: stripped orphaned {{#each founders}}{{#if board_yn}} loops
  that were only for building all_directors array (now pre-computed)
- Initial Bylaws: same orphaned loop cleanup
- non_founder_directors|length → non_founder_directors_yn in conditionals
- all_directors|length → all_directors_count in conditionals
</commit_message>
<xml_diff>
--- a/templates/action_of_incorporator.docx
+++ b/templates/action_of_incorporator.docx
@@ -127,7 +127,7 @@
         <w:rPr>
           <w:rFonts w:ascii="Times New Roman" w:hAnsi="Times New Roman"/>
         </w:rPr>
-        <w:t xml:space="preserve">RESOLVED, that {{#if Founders|length &gt; 0}}{{#each founders}}{{#if founder.board_yn == True}}{{/if}}{{/each}}{{/if}}{{#if NonFounderDirectors|length &gt; 0}}{{#each nonfounderdirectors}}{{/each}}{{/if}}{{all_directors_text}}{{/if}}{{/each}} are{{/if}} hereby elected as member{{#if all_directors|length &gt; 1}}s{{/if}} of the Corporation’s Board of Directors (the “Board”) to serve, commencing upon effectiveness of this Action of Incorporator, until their successors are duly elected or until their earlier resignation, death or removal from office.</w:t>
+        <w:t xml:space="preserve">RESOLVED, that {{all_directors_text}} hereby elected as member{{#if all_directors_count &gt; 1}}s{{/if}} of the Corporation’s Board of Directors (the “Board”) to serve, commencing upon effectiveness of this Action of Incorporator, until their successors are duly elected or until their earlier resignation, death or removal from office.</w:t>
       </w:r>
       <w:proofErr w:type="spellStart"/>
       <w:proofErr w:type="spellEnd"/>
@@ -189,7 +189,7 @@
         <w:rPr>
           <w:rFonts w:ascii="Times New Roman" w:hAnsi="Times New Roman"/>
         </w:rPr>
-        <w:t xml:space="preserve">Having consented to the foregoing action and having appointed the initial member{{#if all_directors|length &gt; 1}}s{{/if}} of the Board above, the undersigned Incorporator does hereby resign as the incorporator of the Corporation, as of the date set forth below. This Action of Incorporator shall be kept in the minute books of the Corporation.</w:t>
+        <w:t xml:space="preserve">Having consented to the foregoing action and having appointed the initial member{{#if all_directors_count &gt; 1}}s{{/if}} of the Board above, the undersigned Incorporator does hereby resign as the incorporator of the Corporation, as of the date set forth below. This Action of Incorporator shall be kept in the minute books of the Corporation.</w:t>
       </w:r>
       <w:proofErr w:type="spellStart"/>
       <w:proofErr w:type="spellEnd"/>

</xml_diff>